<commit_message>
Marilyn Monroe: revisão crítica da Parte 2
Co-Authored-By: Claude Opus 5.5 <noreply@anthropic.com>
Claude-Session: https://claude.ai/code/session_01MJjUEEZrxQDEUifKK2vj9g
</commit_message>
<xml_diff>
--- a/roteiros/marilyn-monroe/MarilynMonroe_Parte2.docx
+++ b/roteiros/marilyn-monroe/MarilynMonroe_Parte2.docx
@@ -63,7 +63,7 @@
         <w:rPr>
           <w:color w:val="000000"/>
         </w:rPr>
-        <w:t>Ele trabalhava numa unidade de filmes das forças armadas, que tinha como comandante um ator de Hollywood chamado Ronald Reagan. O futuro presidente dos Estados Unidos.</w:t>
+        <w:t>Ele servia numa unidade de filmes do exército. Segundo Conover, a ordem para aquelas fotos veio de um oficial da unidade, um ator de Hollywood chamado Ronald Reagan. O futuro presidente dos Estados Unidos.</w:t>
       </w:r>
     </w:p>
     <w:p>
@@ -127,7 +127,7 @@
         <w:rPr>
           <w:color w:val="000000"/>
         </w:rPr>
-        <w:t>Em poucos meses, o rosto dela estava na capa de dezenas de revistas. Nenhuma delas trazia o nome verdadeiro. Para os leitores, era só mais uma garota bonita de maiô.</w:t>
+        <w:t>Em poucos meses, o rosto dela estava na capa de dezenas de revistas. Para os leitores, era só mais uma garota bonita de maiô.</w:t>
       </w:r>
     </w:p>
     <w:p>
@@ -135,7 +135,7 @@
         <w:rPr>
           <w:color w:val="000000"/>
         </w:rPr>
-        <w:t>Só que havia um problema. Os estúdios de cinema não queriam contratar moças casadas. Uma esposa podia engravidar a qualquer momento e parar as filmagens.</w:t>
+        <w:t>Só que havia um problema. Segundo os biógrafos, os estúdios de cinema preferiam moças solteiras. Uma esposa podia engravidar a qualquer momento e parar as filmagens.</w:t>
       </w:r>
     </w:p>
     <w:p>
@@ -375,7 +375,7 @@
         <w:rPr>
           <w:color w:val="C00000"/>
         </w:rPr>
-        <w:t>Aquela foto de cinquenta dólares ia voltar para assombrar Marilyn. E ia cair nas mãos de um homem que enxergou nela uma mina de ouro. Mas, antes disso, outro homem entrou na vida dela. E foi ele quem a levou pela primeira vez para perto da morte.</w:t>
+        <w:t>Aquela foto de cinquenta dólares ia voltar para assombrar Marilyn. E ia cair nas mãos de um homem que enxergou nela uma mina de ouro. Mas, antes disso, outro homem entrou na vida dela. E foi a morte dele que deixou Marilyn, mais uma vez, à beira do abismo.</w:t>
       </w:r>
     </w:p>
     <w:p>
@@ -439,7 +439,7 @@
         <w:rPr>
           <w:color w:val="000000"/>
         </w:rPr>
-        <w:t>Em dezembro de mil novecentos e cinquenta, Hyde conseguiu para ela um novo contrato de sete anos com a Fox.</w:t>
+        <w:t>Em dezembro de mil novecentos e cinquenta, Hyde conseguiu para ela um novo contrato com a Fox.</w:t>
       </w:r>
     </w:p>
     <w:p>
@@ -543,7 +543,7 @@
         <w:rPr>
           <w:color w:val="000000"/>
         </w:rPr>
-        <w:t>Chamou uma repórter da agência United Press, Aline Mosby, e contou a verdade. Disse que estava sem dinheiro, que devia o aluguel e que precisava dos cinquenta dólares.</w:t>
+        <w:t>Chamou uma repórter da agência United Press, Aline Mosby, e contou a verdade. Disse que estava sem dinheiro e que precisava daqueles cinquenta dólares.</w:t>
       </w:r>
     </w:p>
     <w:p>
@@ -559,7 +559,7 @@
         <w:rPr>
           <w:color w:val="000000"/>
         </w:rPr>
-        <w:t>Na mesma época, veio outra revelação. Os jornais descobriram que a mãe de Marilyn estava viva. O estúdio tinha espalhado a versão de que ela era órfã.</w:t>
+        <w:t>Na mesma época, veio outra revelação. Os jornais descobriram que a mãe de Marilyn estava viva. Até ali, o público acreditava que Marilyn era órfã.</w:t>
       </w:r>
     </w:p>
     <w:p>
@@ -687,7 +687,7 @@
         <w:rPr>
           <w:color w:val="000000"/>
         </w:rPr>
-        <w:t>Quando pediu um camarim à altura, conta-se que ouviu do estúdio que ainda não era uma estrela. Ela respondeu que, estrela ou não, era a loira do filme.</w:t>
+        <w:t>Quando pediu um camarim à altura, ouviu do estúdio que ainda não era uma estrela. Segundo a história que ela mesma repetia, respondeu: "Seja como for, eu sou a loira."</w:t>
       </w:r>
     </w:p>
     <w:p>

</xml_diff>